<commit_message>
tune: tighten false-positive suppression for atmospheric turbulence
Three defaults raised to combat limb jitter and seeing-induced speckles:

DETECTOR_DISK_MARGIN   0.12 → 0.25
  Excludes outermost 25% of disk radius from the detection zone.
  The solar limb concentrates atmospheric shimmer, limb darkening
  edge effects, and seeing jitter. A 12% buffer was too narrow.

CENTRE_EDGE_RATIO_MIN  1.5 → 2.5
  Inner disk signal must be 2.5× the limb-ring signal to fire.
  Atmospheric speckles tend to be disk-wide (ratio ≈ 1.0-1.5);
  a genuine dark silhouette crossing the bright interior produces
  a strongly concentrated inner signal.

CONSEC_FRAMES_REQUIRED 5 → 7
  Atmospheric shimmer typically triggers 1-3 consecutive frames;
  raising to 7 (≈466 ms) rejects it while still safely detecting
  aircraft transits (8-30 frames at 15 fps, i.e. 0.5-2 s).

All three remain configurable via environment variables.

Co-authored-by: Copilot <223556219+Copilot@users.noreply.github.com>
</commit_message>
<xml_diff>
--- a/docs/Flymoon_Technical_Overview.docx
+++ b/docs/Flymoon_Technical_Overview.docx
@@ -890,37 +890,49 @@
       </w:r>
     </w:p>
     <w:p>
-      <w:pPr/>
-      <w:r>
-        <w:t>The root cause of missed transits in the original implementation was a startup latency gap: when a detection fired, a new ffmpeg process was launched to open a fresh RTSP connection at full resolution. That connection negotiation takes 0.5–1.5 seconds — longer than many aircraft transits (0.5–2 s). By the time recording began, the transit had already passed.</w:t>
+      <w:r>
+        <w:t xml:space="preserve">The root cause of missed transits in the original implementation was a startup latency gap: when a detection fired, a new ffmpeg process was launched to open a fresh RTSP connection at </w:t>
+      </w:r>
+      <w:r>
+        <w:lastRenderedPageBreak/>
+        <w:t>full resolution. That connection negotiation takes 0.5–1.5 seconds — longer than many aircraft transits (0.5–2 s). By the time recording began, the transit had already passed.</w:t>
       </w:r>
     </w:p>
     <w:p>
-      <w:pPr/>
       <w:r>
         <w:t>The fix is a continuously-running second ffmpeg reader that decodes the telescope's full-resolution MJPEG stream and stores every frame as compressed JPEG bytes in a bounded deque (circular buffer). The buffer holds approximately DETECTION_PRE_BUFFER × 30 frames (default 150 frames ≈ 5 seconds). Because the deque is bounded, new frames overwrite the oldest automatically — no manual management required.</w:t>
       </w:r>
     </w:p>
     <w:p>
-      <w:pPr/>
       <w:r>
         <w:t>On detection:</w:t>
+      </w:r>
+      <w:r>
         <w:br/>
         <w:t xml:space="preserve">  1. Snapshot the entire buffer — these are the pre-trigger frames, guaranteed to</w:t>
+      </w:r>
+      <w:r>
         <w:br/>
         <w:t xml:space="preserve">     include the transit moment.</w:t>
+      </w:r>
+      <w:r>
         <w:br/>
         <w:t xml:space="preserve">  2. Continue polling the buffer for DETECTION_POST_BUFFER seconds (default 5 s)</w:t>
+      </w:r>
+      <w:r>
         <w:br/>
         <w:t xml:space="preserve">     to capture the aircraft exiting the disk.</w:t>
+      </w:r>
+      <w:r>
         <w:br/>
         <w:t xml:space="preserve">  3. Decode all JPEG frames, write to an MP4 file via cv2.VideoWriter (mp4v codec).</w:t>
+      </w:r>
+      <w:r>
         <w:br/>
         <w:t xml:space="preserve">  4. Generate a thumbnail from the frame with peak scene-change signal.</w:t>
       </w:r>
     </w:p>
     <w:p>
-      <w:pPr/>
       <w:r>
         <w:t>Memory footprint: ≈150 frames × ~150 KB JPEG ≈ 22 MB at typical full-res sizes. The hi-res reader runs as a daemon thread and is cleaned up when detection stops.</w:t>
       </w:r>
@@ -943,7 +955,6 @@
         <w:pStyle w:val="Heading2"/>
       </w:pPr>
       <w:r>
-        <w:lastRenderedPageBreak/>
         <w:t>4.1 Disk Finding and Masking</w:t>
       </w:r>
     </w:p>
@@ -980,7 +991,11 @@
     </w:p>
     <w:p>
       <w:r>
-        <w:t>Static blobs (appearing in &gt;25% of frames at the same position) are classified as sunspots. The analyser enhances sunspot detection using CLAHE (Contrast Limited Adaptive Histogram Equalisation) with clipLimit=3.0, which boosts local contrast to reveal subtle dark features. A dual-verification step requires each candidate sunspot to appear in both the CLAHE-enhanced and raw reference images.</w:t>
+        <w:t xml:space="preserve">Static blobs (appearing in &gt;25% of frames at the same position) are classified as sunspots. The analyser enhances sunspot detection using CLAHE (Contrast Limited Adaptive Histogram Equalisation) with clipLimit=3.0, which boosts local contrast to reveal subtle dark features. A </w:t>
+      </w:r>
+      <w:r>
+        <w:lastRenderedPageBreak/>
+        <w:t>dual-verification step requires each candidate sunspot to appear in both the CLAHE-enhanced and raw reference images.</w:t>
       </w:r>
     </w:p>
     <w:p>
@@ -1060,7 +1075,6 @@
         <w:rPr>
           <w:b/>
         </w:rPr>
-        <w:lastRenderedPageBreak/>
         <w:t xml:space="preserve">Disk-aware masking over rectangular ROI. </w:t>
       </w:r>
       <w:r>
@@ -1101,9 +1115,15 @@
       </w:r>
     </w:p>
     <w:p>
-      <w:pPr/>
-      <w:r>
-        <w:t>Circular buffer over on-demand recording. Launching a new ffmpeg RTSP session on detection introduces a 0.5–1.5 s startup gap that exceeds the transit duration for fast crossings. Running a continuous full-resolution reader with a bounded deque ensures pre-trigger frames are always available the instant detection fires, eliminating the gap entirely.</w:t>
+      <w:r>
+        <w:rPr>
+          <w:b/>
+          <w:bCs/>
+        </w:rPr>
+        <w:t>Circular buffer over on-demand recording.</w:t>
+      </w:r>
+      <w:r>
+        <w:t xml:space="preserve"> Launching a new ffmpeg RTSP session on detection introduces a 0.5–1.5 s startup gap that exceeds the transit duration for fast crossings. Running a continuous full-resolution reader with a bounded deque ensures pre-trigger frames are always available the instant detection fires, eliminating the gap entirely.</w:t>
       </w:r>
     </w:p>
     <w:p>
@@ -1111,6 +1131,7 @@
         <w:pStyle w:val="Heading1"/>
       </w:pPr>
       <w:r>
+        <w:lastRenderedPageBreak/>
         <w:t>6. Configuration Reference</w:t>
       </w:r>
     </w:p>
@@ -1280,11 +1301,8 @@
             <w:tcW w:w="2911" w:type="dxa"/>
           </w:tcPr>
           <w:p>
-            <w:pPr>
-              <w:cnfStyle w:val="000000100000" w:firstRow="0" w:lastRow="0" w:firstColumn="0" w:lastColumn="0" w:oddVBand="0" w:evenVBand="0" w:oddHBand="1" w:evenHBand="0" w:firstRowFirstColumn="0" w:firstRowLastColumn="0" w:lastRowFirstColumn="0" w:lastRowLastColumn="0"/>
-            </w:pPr>
             <w:r>
-              <w:t>5</w:t>
+              <w:t>7</w:t>
             </w:r>
           </w:p>
         </w:tc>
@@ -1293,11 +1311,8 @@
             <w:tcW w:w="2911" w:type="dxa"/>
           </w:tcPr>
           <w:p>
-            <w:pPr>
-              <w:cnfStyle w:val="000000100000" w:firstRow="0" w:lastRow="0" w:firstColumn="0" w:lastColumn="0" w:oddVBand="0" w:evenVBand="0" w:oddHBand="1" w:evenHBand="0" w:firstRowFirstColumn="0" w:firstRowLastColumn="0" w:lastRowFirstColumn="0" w:lastRowLastColumn="0"/>
-            </w:pPr>
             <w:r>
-              <w:t>Consecutive frames for detection confirmation</w:t>
+              <w:t>Consecutive frames required for detection confirmation (raised from 5)</w:t>
             </w:r>
           </w:p>
         </w:tc>
@@ -1366,11 +1381,8 @@
             <w:tcW w:w="2911" w:type="dxa"/>
           </w:tcPr>
           <w:p>
-            <w:pPr>
-              <w:cnfStyle w:val="000000100000" w:firstRow="0" w:lastRow="0" w:firstColumn="0" w:lastColumn="0" w:oddVBand="0" w:evenVBand="0" w:oddHBand="1" w:evenHBand="0" w:firstRowFirstColumn="0" w:firstRowLastColumn="0" w:lastRowFirstColumn="0" w:lastRowLastColumn="0"/>
-            </w:pPr>
             <w:r>
-              <w:t>1.5</w:t>
+              <w:t>2.5</w:t>
             </w:r>
           </w:p>
         </w:tc>
@@ -1379,11 +1391,8 @@
             <w:tcW w:w="2911" w:type="dxa"/>
           </w:tcPr>
           <w:p>
-            <w:pPr>
-              <w:cnfStyle w:val="000000100000" w:firstRow="0" w:lastRow="0" w:firstColumn="0" w:lastColumn="0" w:oddVBand="0" w:evenVBand="0" w:oddHBand="1" w:evenHBand="0" w:firstRowFirstColumn="0" w:firstRowLastColumn="0" w:lastRowFirstColumn="0" w:lastRowLastColumn="0"/>
-            </w:pPr>
             <w:r>
-              <w:t>Minimum inner-disk / limb signal ratio</w:t>
+              <w:t>Minimum inner-disk / limb signal ratio (raised from 1.5)</w:t>
             </w:r>
           </w:p>
         </w:tc>
@@ -1409,11 +1418,8 @@
             <w:tcW w:w="2911" w:type="dxa"/>
           </w:tcPr>
           <w:p>
-            <w:pPr>
-              <w:cnfStyle w:val="000000010000" w:firstRow="0" w:lastRow="0" w:firstColumn="0" w:lastColumn="0" w:oddVBand="0" w:evenVBand="0" w:oddHBand="0" w:evenHBand="1" w:firstRowFirstColumn="0" w:firstRowLastColumn="0" w:lastRowFirstColumn="0" w:lastRowLastColumn="0"/>
-            </w:pPr>
             <w:r>
-              <w:t>0.12</w:t>
+              <w:t>0.25</w:t>
             </w:r>
           </w:p>
         </w:tc>
@@ -1422,11 +1428,8 @@
             <w:tcW w:w="2911" w:type="dxa"/>
           </w:tcPr>
           <w:p>
-            <w:pPr>
-              <w:cnfStyle w:val="000000010000" w:firstRow="0" w:lastRow="0" w:firstColumn="0" w:lastColumn="0" w:oddVBand="0" w:evenVBand="0" w:oddHBand="0" w:evenHBand="1" w:firstRowFirstColumn="0" w:firstRowLastColumn="0" w:lastRowFirstColumn="0" w:lastRowLastColumn="0"/>
-            </w:pPr>
             <w:r>
-              <w:t>Fraction of disk radius excluded as limb margin</w:t>
+              <w:t>Fraction of disk radius excluded as limb margin (raised from 0.12)</w:t>
             </w:r>
           </w:p>
         </w:tc>
@@ -1604,9 +1607,13 @@
         </w:tc>
       </w:tr>
       <w:tr>
+        <w:trPr>
+          <w:cnfStyle w:val="000000100000" w:firstRow="0" w:lastRow="0" w:firstColumn="0" w:lastColumn="0" w:oddVBand="0" w:evenVBand="0" w:oddHBand="1" w:evenHBand="0" w:firstRowFirstColumn="0" w:firstRowLastColumn="0" w:lastRowFirstColumn="0" w:lastRowLastColumn="0"/>
+        </w:trPr>
         <w:tc>
           <w:tcPr>
-            <w:tcW w:type="dxa" w:w="2920"/>
+            <w:cnfStyle w:val="001000000000" w:firstRow="0" w:lastRow="0" w:firstColumn="1" w:lastColumn="0" w:oddVBand="0" w:evenVBand="0" w:oddHBand="0" w:evenHBand="0" w:firstRowFirstColumn="0" w:firstRowLastColumn="0" w:lastRowFirstColumn="0" w:lastRowLastColumn="0"/>
+            <w:tcW w:w="2920" w:type="dxa"/>
           </w:tcPr>
           <w:p>
             <w:r>
@@ -1619,9 +1626,12 @@
         </w:tc>
         <w:tc>
           <w:tcPr>
-            <w:tcW w:type="dxa" w:w="2911"/>
+            <w:tcW w:w="2911" w:type="dxa"/>
           </w:tcPr>
           <w:p>
+            <w:pPr>
+              <w:cnfStyle w:val="000000100000" w:firstRow="0" w:lastRow="0" w:firstColumn="0" w:lastColumn="0" w:oddVBand="0" w:evenVBand="0" w:oddHBand="1" w:evenHBand="0" w:firstRowFirstColumn="0" w:firstRowLastColumn="0" w:lastRowFirstColumn="0" w:lastRowLastColumn="0"/>
+            </w:pPr>
             <w:r>
               <w:rPr>
                 <w:sz w:val="20"/>
@@ -1632,9 +1642,12 @@
         </w:tc>
         <w:tc>
           <w:tcPr>
-            <w:tcW w:type="dxa" w:w="2911"/>
+            <w:tcW w:w="2911" w:type="dxa"/>
           </w:tcPr>
           <w:p>
+            <w:pPr>
+              <w:cnfStyle w:val="000000100000" w:firstRow="0" w:lastRow="0" w:firstColumn="0" w:lastColumn="0" w:oddVBand="0" w:evenVBand="0" w:oddHBand="1" w:evenHBand="0" w:firstRowFirstColumn="0" w:firstRowLastColumn="0" w:lastRowFirstColumn="0" w:lastRowLastColumn="0"/>
+            </w:pPr>
             <w:r>
               <w:rPr>
                 <w:sz w:val="20"/>
@@ -1645,9 +1658,13 @@
         </w:tc>
       </w:tr>
       <w:tr>
+        <w:trPr>
+          <w:cnfStyle w:val="000000010000" w:firstRow="0" w:lastRow="0" w:firstColumn="0" w:lastColumn="0" w:oddVBand="0" w:evenVBand="0" w:oddHBand="0" w:evenHBand="1" w:firstRowFirstColumn="0" w:firstRowLastColumn="0" w:lastRowFirstColumn="0" w:lastRowLastColumn="0"/>
+        </w:trPr>
         <w:tc>
           <w:tcPr>
-            <w:tcW w:type="dxa" w:w="2920"/>
+            <w:cnfStyle w:val="001000000000" w:firstRow="0" w:lastRow="0" w:firstColumn="1" w:lastColumn="0" w:oddVBand="0" w:evenVBand="0" w:oddHBand="0" w:evenHBand="0" w:firstRowFirstColumn="0" w:firstRowLastColumn="0" w:lastRowFirstColumn="0" w:lastRowLastColumn="0"/>
+            <w:tcW w:w="2920" w:type="dxa"/>
           </w:tcPr>
           <w:p>
             <w:r>
@@ -1660,9 +1677,12 @@
         </w:tc>
         <w:tc>
           <w:tcPr>
-            <w:tcW w:type="dxa" w:w="2911"/>
+            <w:tcW w:w="2911" w:type="dxa"/>
           </w:tcPr>
           <w:p>
+            <w:pPr>
+              <w:cnfStyle w:val="000000010000" w:firstRow="0" w:lastRow="0" w:firstColumn="0" w:lastColumn="0" w:oddVBand="0" w:evenVBand="0" w:oddHBand="0" w:evenHBand="1" w:firstRowFirstColumn="0" w:firstRowLastColumn="0" w:lastRowFirstColumn="0" w:lastRowLastColumn="0"/>
+            </w:pPr>
             <w:r>
               <w:rPr>
                 <w:sz w:val="20"/>
@@ -1673,9 +1693,12 @@
         </w:tc>
         <w:tc>
           <w:tcPr>
-            <w:tcW w:type="dxa" w:w="2911"/>
+            <w:tcW w:w="2911" w:type="dxa"/>
           </w:tcPr>
           <w:p>
+            <w:pPr>
+              <w:cnfStyle w:val="000000010000" w:firstRow="0" w:lastRow="0" w:firstColumn="0" w:lastColumn="0" w:oddVBand="0" w:evenVBand="0" w:oddHBand="0" w:evenHBand="1" w:firstRowFirstColumn="0" w:firstRowLastColumn="0" w:lastRowFirstColumn="0" w:lastRowLastColumn="0"/>
+            </w:pPr>
             <w:r>
               <w:rPr>
                 <w:sz w:val="20"/>
@@ -1691,7 +1714,6 @@
         <w:pStyle w:val="Heading1"/>
       </w:pPr>
       <w:r>
-        <w:lastRenderedPageBreak/>
         <w:t>7. End-to-End Data Flow</w:t>
       </w:r>
     </w:p>
@@ -1777,6 +1799,14 @@
           <w:sz w:val="18"/>
         </w:rPr>
         <w:br/>
+      </w:r>
+      <w:r>
+        <w:rPr>
+          <w:rFonts w:ascii="Consolas" w:hAnsi="Consolas"/>
+          <w:color w:val="333333"/>
+          <w:sz w:val="18"/>
+        </w:rPr>
+        <w:lastRenderedPageBreak/>
         <w:t xml:space="preserve">      → minimize_scalar() → σ_min, t_min</w:t>
       </w:r>
       <w:r>
@@ -1836,47 +1866,6 @@
           <w:sz w:val="18"/>
         </w:rPr>
         <w:t>RTSP stream → ffmpeg (low-res) → 160×90 RGB @ 15 fps</w:t>
-        <w:br/>
-        <w:t xml:space="preserve">  → every 30 frames: _detect_disk() → (cx, cy, r)</w:t>
-        <w:br/>
-        <w:t xml:space="preserve">  → build circular disk mask (inner) + limb mask (ring)</w:t>
-        <w:br/>
-        <w:t xml:space="preserve">  → per frame:</w:t>
-        <w:br/>
-        <w:t xml:space="preserve">      Signal A = mean(|frame − prev_frame|) inside disk mask</w:t>
-        <w:br/>
-        <w:t xml:space="preserve">      Signal B = mean(|frame − ref_frame| × disk_weight)</w:t>
-        <w:br/>
-        <w:t xml:space="preserve">      centre_ratio = disk_signal / limb_signal</w:t>
-        <w:br/>
-        <w:t xml:space="preserve">      adaptive threshold = median + max(3×MAD, 0.5×median)</w:t>
-        <w:br/>
-        <w:t xml:space="preserve">  → if A &gt; thresh AND B &gt; thresh AND ratio ≥ 1.5:</w:t>
-        <w:br/>
-        <w:t xml:space="preserve">      consec_count++</w:t>
-        <w:br/>
-        <w:t xml:space="preserve">  → if consec_count reaches 5:</w:t>
-        <w:br/>
-        <w:t xml:space="preserve">      → fire detection event</w:t>
-        <w:br/>
-        <w:t xml:space="preserve">      → save diagnostic frames (with disk overlay)</w:t>
-        <w:br/>
-        <w:t xml:space="preserve">      → snapshot pre-trigger frames from circular buffer</w:t>
-        <w:br/>
-        <w:t xml:space="preserve">      → collect post-trigger frames for DETECTION_POST_BUFFER seconds</w:t>
-        <w:br/>
-        <w:t xml:space="preserve">      → write combined frames to MP4 via cv2.VideoWriter (mp4v)</w:t>
-        <w:br/>
-        <w:t xml:space="preserve">      → enrich with flight data (OpenSky first, FA fallback)</w:t>
-        <w:br/>
-        <w:br/>
-        <w:t>Parallel hi-res reader (runs continuously alongside detection):</w:t>
-        <w:br/>
-        <w:t xml:space="preserve">  RTSP stream → ffmpeg (full-res MJPEG) → bounded deque</w:t>
-        <w:br/>
-        <w:t xml:space="preserve">  Capacity = DETECTION_PRE_BUFFER × 30 frames (default: 150 frames = 5 s)</w:t>
-        <w:br/>
-        <w:t xml:space="preserve">  Newest frames silently overwrite oldest — transit is always in the buffer.</w:t>
       </w:r>
       <w:r>
         <w:rPr>
@@ -1884,6 +1873,8 @@
           <w:color w:val="333333"/>
           <w:sz w:val="18"/>
         </w:rPr>
+        <w:br/>
+        <w:t xml:space="preserve">  → every 30 frames: _detect_disk() → (cx, cy, r)</w:t>
       </w:r>
       <w:r>
         <w:rPr>
@@ -1891,6 +1882,8 @@
           <w:color w:val="333333"/>
           <w:sz w:val="18"/>
         </w:rPr>
+        <w:br/>
+        <w:t xml:space="preserve">  → build circular disk mask (inner) + limb mask (ring)</w:t>
       </w:r>
       <w:r>
         <w:rPr>
@@ -1898,6 +1891,8 @@
           <w:color w:val="333333"/>
           <w:sz w:val="18"/>
         </w:rPr>
+        <w:br/>
+        <w:t xml:space="preserve">  → per frame:</w:t>
       </w:r>
       <w:r>
         <w:rPr>
@@ -1905,6 +1900,8 @@
           <w:color w:val="333333"/>
           <w:sz w:val="18"/>
         </w:rPr>
+        <w:br/>
+        <w:t xml:space="preserve">      Signal A = mean(|frame − prev_frame|) inside disk mask</w:t>
       </w:r>
       <w:r>
         <w:rPr>
@@ -1912,6 +1909,8 @@
           <w:color w:val="333333"/>
           <w:sz w:val="18"/>
         </w:rPr>
+        <w:br/>
+        <w:t xml:space="preserve">      Signal B = mean(|frame − ref_frame| × disk_weight)</w:t>
       </w:r>
       <w:r>
         <w:rPr>
@@ -1919,6 +1918,8 @@
           <w:color w:val="333333"/>
           <w:sz w:val="18"/>
         </w:rPr>
+        <w:br/>
+        <w:t xml:space="preserve">      centre_ratio = disk_signal / limb_signal</w:t>
       </w:r>
       <w:r>
         <w:rPr>
@@ -1926,6 +1927,8 @@
           <w:color w:val="333333"/>
           <w:sz w:val="18"/>
         </w:rPr>
+        <w:br/>
+        <w:t xml:space="preserve">      adaptive threshold = median + max(3×MAD, 0.5×median)</w:t>
       </w:r>
       <w:r>
         <w:rPr>
@@ -1933,6 +1936,8 @@
           <w:color w:val="333333"/>
           <w:sz w:val="18"/>
         </w:rPr>
+        <w:br/>
+        <w:t xml:space="preserve">  → if A &gt; thresh AND B &gt; thresh AND ratio ≥ 1.5:</w:t>
       </w:r>
       <w:r>
         <w:rPr>
@@ -1940,6 +1945,8 @@
           <w:color w:val="333333"/>
           <w:sz w:val="18"/>
         </w:rPr>
+        <w:br/>
+        <w:t xml:space="preserve">      consec_count++</w:t>
       </w:r>
       <w:r>
         <w:rPr>
@@ -1947,6 +1954,8 @@
           <w:color w:val="333333"/>
           <w:sz w:val="18"/>
         </w:rPr>
+        <w:br/>
+        <w:t xml:space="preserve">  → if consec_count reaches 5:</w:t>
       </w:r>
       <w:r>
         <w:rPr>
@@ -1954,6 +1963,8 @@
           <w:color w:val="333333"/>
           <w:sz w:val="18"/>
         </w:rPr>
+        <w:br/>
+        <w:t xml:space="preserve">      → fire detection event</w:t>
       </w:r>
       <w:r>
         <w:rPr>
@@ -1961,6 +1972,8 @@
           <w:color w:val="333333"/>
           <w:sz w:val="18"/>
         </w:rPr>
+        <w:br/>
+        <w:t xml:space="preserve">      → save diagnostic frames (with disk overlay)</w:t>
       </w:r>
       <w:r>
         <w:rPr>
@@ -1968,6 +1981,8 @@
           <w:color w:val="333333"/>
           <w:sz w:val="18"/>
         </w:rPr>
+        <w:br/>
+        <w:t xml:space="preserve">      → snapshot pre-trigger frames from circular buffer</w:t>
       </w:r>
       <w:r>
         <w:rPr>
@@ -1975,6 +1990,70 @@
           <w:color w:val="333333"/>
           <w:sz w:val="18"/>
         </w:rPr>
+        <w:br/>
+        <w:t xml:space="preserve">      → collect post-trigger frames for DETECTION_POST_BUFFER seconds</w:t>
+      </w:r>
+      <w:r>
+        <w:rPr>
+          <w:rFonts w:ascii="Consolas" w:hAnsi="Consolas"/>
+          <w:color w:val="333333"/>
+          <w:sz w:val="18"/>
+        </w:rPr>
+        <w:br/>
+        <w:t xml:space="preserve">      → write combined frames to MP4 via cv2.VideoWriter (mp4v)</w:t>
+      </w:r>
+      <w:r>
+        <w:rPr>
+          <w:rFonts w:ascii="Consolas" w:hAnsi="Consolas"/>
+          <w:color w:val="333333"/>
+          <w:sz w:val="18"/>
+        </w:rPr>
+        <w:br/>
+        <w:t xml:space="preserve">      → enrich with flight data (OpenSky first, FA fallback)</w:t>
+      </w:r>
+      <w:r>
+        <w:rPr>
+          <w:rFonts w:ascii="Consolas" w:hAnsi="Consolas"/>
+          <w:color w:val="333333"/>
+          <w:sz w:val="18"/>
+        </w:rPr>
+        <w:br/>
+      </w:r>
+      <w:r>
+        <w:rPr>
+          <w:rFonts w:ascii="Consolas" w:hAnsi="Consolas"/>
+          <w:color w:val="333333"/>
+          <w:sz w:val="18"/>
+        </w:rPr>
+        <w:br/>
+        <w:t>Parallel hi-res reader (runs continuously alongside detection):</w:t>
+      </w:r>
+      <w:r>
+        <w:rPr>
+          <w:rFonts w:ascii="Consolas" w:hAnsi="Consolas"/>
+          <w:color w:val="333333"/>
+          <w:sz w:val="18"/>
+        </w:rPr>
+        <w:br/>
+        <w:t xml:space="preserve">  RTSP stream → ffmpeg (full-res MJPEG) → bounded deque</w:t>
+      </w:r>
+      <w:r>
+        <w:rPr>
+          <w:rFonts w:ascii="Consolas" w:hAnsi="Consolas"/>
+          <w:color w:val="333333"/>
+          <w:sz w:val="18"/>
+        </w:rPr>
+        <w:br/>
+        <w:t xml:space="preserve">  Capacity = DETECTION_PRE_BUFFER × 30 frames (default: 150 frames = 5 s)</w:t>
+      </w:r>
+      <w:r>
+        <w:rPr>
+          <w:rFonts w:ascii="Consolas" w:hAnsi="Consolas"/>
+          <w:color w:val="333333"/>
+          <w:sz w:val="18"/>
+        </w:rPr>
+        <w:br/>
+        <w:t xml:space="preserve">  Newest frames silently overwrite oldest — transit is always in the buffer.</w:t>
       </w:r>
     </w:p>
     <w:p/>

</xml_diff>